<commit_message>
Integrate Adobe Express Crash Course + add MP23 Quick Actions Speed Run
- New MP23 bonus mini-project: Quick Actions Speed Run (15 min)
  Based on Adobe's Module 4 (Quick Actions): resize for 3 platforms, remove
  background, trim video, convert to GIF, optional Firefly AI action

- New "Deeper Learning" section in index.html:
  * Direct link to free Adobe Coursera Crash Course (6 hours, certificate)
  * Behance portfolio guidance for Task 2b showcase
  * Adobe Certified Professional exam pathway (Content Creation + Marketing)

- New coursera-integration-map.docx: maps every Coursera resource to a
  specific lesson/mini-project with concrete enrichment suggestions

- Updated check-yourself Q&A to cover MP23 (Quick Action categories +
  background removal specifics)

Live URL: https://yunshugao.github.io/10immya-2026/term2-video/
</commit_message>
<xml_diff>
--- a/term2-video/adobe-express-mini-projects.docx
+++ b/term2-video/adobe-express-mini-projects.docx
@@ -9987,6 +9987,425 @@
                 <w:sz w:val="22"/>
               </w:rPr>
               <w:t>FINAL — Task 2b MP4 + 150-word reflection PDF uploaded. Showcase attended. ⭐ UNIT COMPLETE.</w:t>
+            </w:r>
+          </w:p>
+        </w:tc>
+      </w:tr>
+    </w:tbl>
+    <w:p>
+      <w:r>
+        <w:br w:type="page"/>
+      </w:r>
+    </w:p>
+    <w:tbl>
+      <w:tblPr>
+        <w:tblW w:type="auto" w:w="0"/>
+        <w:tblLook w:firstColumn="1" w:firstRow="1" w:lastColumn="0" w:lastRow="0" w:noHBand="0" w:noVBand="1" w:val="04A0"/>
+      </w:tblPr>
+      <w:tblGrid>
+        <w:gridCol w:w="3324"/>
+        <w:gridCol w:w="3324"/>
+        <w:gridCol w:w="3324"/>
+      </w:tblGrid>
+      <w:tr>
+        <w:tc>
+          <w:tcPr>
+            <w:tcW w:type="dxa" w:w="1984"/>
+            <w:shd w:val="clear" w:color="auto" w:fill="0F172A"/>
+          </w:tcPr>
+          <w:p>
+            <w:r/>
+            <w:r>
+              <w:rPr>
+                <w:rFonts w:ascii="Calibri" w:hAnsi="Calibri"/>
+                <w:b/>
+                <w:color w:val="4ADE80"/>
+                <w:sz w:val="56"/>
+              </w:rPr>
+              <w:t>MP23</w:t>
+            </w:r>
+          </w:p>
+        </w:tc>
+        <w:tc>
+          <w:tcPr>
+            <w:tcW w:type="dxa" w:w="6236"/>
+            <w:shd w:val="clear" w:color="auto" w:fill="0F172A"/>
+          </w:tcPr>
+          <w:p>
+            <w:r/>
+            <w:r>
+              <w:rPr>
+                <w:rFonts w:ascii="Calibri" w:hAnsi="Calibri"/>
+                <w:b/>
+                <w:color w:val="FFFFFF"/>
+                <w:sz w:val="32"/>
+              </w:rPr>
+              <w:t>Quick Actions Speed Run</w:t>
+            </w:r>
+          </w:p>
+        </w:tc>
+        <w:tc>
+          <w:tcPr>
+            <w:tcW w:type="dxa" w:w="2551"/>
+            <w:shd w:val="clear" w:color="auto" w:fill="0F172A"/>
+          </w:tcPr>
+          <w:p>
+            <w:pPr>
+              <w:jc w:val="right"/>
+            </w:pPr>
+            <w:r/>
+            <w:r>
+              <w:rPr>
+                <w:rFonts w:ascii="Calibri" w:hAnsi="Calibri"/>
+                <w:b/>
+                <w:color w:val="FBBF24"/>
+                <w:sz w:val="22"/>
+              </w:rPr>
+              <w:t>BONUS  •  15 min</w:t>
+            </w:r>
+          </w:p>
+        </w:tc>
+      </w:tr>
+    </w:tbl>
+    <w:p>
+      <w:r>
+        <w:rPr>
+          <w:rFonts w:ascii="Calibri" w:hAnsi="Calibri"/>
+          <w:b w:val="0"/>
+          <w:i w:val="0"/>
+          <w:sz w:val="22"/>
+        </w:rPr>
+      </w:r>
+    </w:p>
+    <w:p>
+      <w:r>
+        <w:rPr>
+          <w:rFonts w:ascii="Calibri" w:hAnsi="Calibri"/>
+          <w:b w:val="0"/>
+          <w:i/>
+          <w:color w:val="646464"/>
+          <w:sz w:val="24"/>
+        </w:rPr>
+        <w:t>Bonus project: Adobe Express Quick Actions let you do in one click what used to take 15. Today: four Quick Actions, four uploads, timer on.</w:t>
+      </w:r>
+    </w:p>
+    <w:p>
+      <w:r>
+        <w:rPr>
+          <w:rFonts w:ascii="Calibri" w:hAnsi="Calibri"/>
+          <w:b w:val="0"/>
+          <w:i w:val="0"/>
+          <w:sz w:val="22"/>
+        </w:rPr>
+      </w:r>
+    </w:p>
+    <w:tbl>
+      <w:tblPr>
+        <w:tblW w:type="auto" w:w="0"/>
+        <w:tblLook w:firstColumn="1" w:firstRow="1" w:lastColumn="0" w:lastRow="0" w:noHBand="0" w:noVBand="1" w:val="04A0"/>
+      </w:tblPr>
+      <w:tblGrid>
+        <w:gridCol w:w="9972"/>
+      </w:tblGrid>
+      <w:tr>
+        <w:tc>
+          <w:tcPr>
+            <w:tcW w:type="dxa" w:w="9972"/>
+            <w:shd w:val="clear" w:color="auto" w:fill="FFF8E1"/>
+          </w:tcPr>
+          <w:p>
+            <w:r/>
+            <w:r>
+              <w:rPr>
+                <w:rFonts w:ascii="Calibri" w:hAnsi="Calibri"/>
+                <w:b/>
+                <w:color w:val="B46400"/>
+                <w:sz w:val="22"/>
+              </w:rPr>
+              <w:t>🎯 GOAL</w:t>
+            </w:r>
+          </w:p>
+          <w:p>
+            <w:r>
+              <w:rPr>
+                <w:rFonts w:ascii="Calibri" w:hAnsi="Calibri"/>
+                <w:sz w:val="22"/>
+              </w:rPr>
+              <w:t>4 Quick-Action outputs uploaded to Classroom: (1) one image resized for 3 social platforms, (2) one photo with background removed, (3) one 10-second trimmed video clip, (4) one video-to-GIF conversion.</w:t>
+            </w:r>
+          </w:p>
+        </w:tc>
+      </w:tr>
+    </w:tbl>
+    <w:p>
+      <w:r>
+        <w:rPr>
+          <w:rFonts w:ascii="Calibri" w:hAnsi="Calibri"/>
+          <w:b w:val="0"/>
+          <w:i w:val="0"/>
+          <w:sz w:val="22"/>
+        </w:rPr>
+      </w:r>
+    </w:p>
+    <w:p>
+      <w:r>
+        <w:rPr>
+          <w:rFonts w:ascii="Calibri" w:hAnsi="Calibri"/>
+          <w:b/>
+          <w:i w:val="0"/>
+          <w:color w:val="1F3A68"/>
+          <w:sz w:val="26"/>
+        </w:rPr>
+        <w:t>STEPS</w:t>
+      </w:r>
+    </w:p>
+    <w:p>
+      <w:r>
+        <w:rPr>
+          <w:rFonts w:ascii="Calibri" w:hAnsi="Calibri"/>
+          <w:b/>
+          <w:color w:val="38BDF8"/>
+          <w:sz w:val="24"/>
+        </w:rPr>
+        <w:t xml:space="preserve">1.  </w:t>
+      </w:r>
+      <w:r>
+        <w:rPr>
+          <w:rFonts w:ascii="Calibri" w:hAnsi="Calibri"/>
+          <w:sz w:val="24"/>
+        </w:rPr>
+        <w:t>Open Adobe Express → click 'Quick Actions' from the home page.</w:t>
+      </w:r>
+    </w:p>
+    <w:p>
+      <w:r>
+        <w:rPr>
+          <w:rFonts w:ascii="Calibri" w:hAnsi="Calibri"/>
+          <w:b/>
+          <w:color w:val="38BDF8"/>
+          <w:sz w:val="24"/>
+        </w:rPr>
+        <w:t xml:space="preserve">2.  </w:t>
+      </w:r>
+      <w:r>
+        <w:rPr>
+          <w:rFonts w:ascii="Calibri" w:hAnsi="Calibri"/>
+          <w:sz w:val="24"/>
+        </w:rPr>
+        <w:t>Take ONE photo (use a stock photo if you prefer). Use 'Resize' — export it at Instagram Post (1080×1080), IG Story (1080×1920), and LinkedIn Post (1200×628) sizes. Upload all 3.</w:t>
+      </w:r>
+    </w:p>
+    <w:p>
+      <w:r>
+        <w:rPr>
+          <w:rFonts w:ascii="Calibri" w:hAnsi="Calibri"/>
+          <w:b/>
+          <w:color w:val="38BDF8"/>
+          <w:sz w:val="24"/>
+        </w:rPr>
+        <w:t xml:space="preserve">3.  </w:t>
+      </w:r>
+      <w:r>
+        <w:rPr>
+          <w:rFonts w:ascii="Calibri" w:hAnsi="Calibri"/>
+          <w:sz w:val="24"/>
+        </w:rPr>
+        <w:t>Take a photo with a clear subject (a mate, a product, a plant). Use 'Remove Background'. Upload the transparent PNG.</w:t>
+      </w:r>
+    </w:p>
+    <w:p>
+      <w:r>
+        <w:rPr>
+          <w:rFonts w:ascii="Calibri" w:hAnsi="Calibri"/>
+          <w:b/>
+          <w:color w:val="38BDF8"/>
+          <w:sz w:val="24"/>
+        </w:rPr>
+        <w:t xml:space="preserve">4.  </w:t>
+      </w:r>
+      <w:r>
+        <w:rPr>
+          <w:rFonts w:ascii="Calibri" w:hAnsi="Calibri"/>
+          <w:sz w:val="24"/>
+        </w:rPr>
+        <w:t>Take a short video on your phone (10–30 sec). Use 'Trim' Quick Action to keep just the best 10 seconds.</w:t>
+      </w:r>
+    </w:p>
+    <w:p>
+      <w:r>
+        <w:rPr>
+          <w:rFonts w:ascii="Calibri" w:hAnsi="Calibri"/>
+          <w:b/>
+          <w:color w:val="38BDF8"/>
+          <w:sz w:val="24"/>
+        </w:rPr>
+        <w:t xml:space="preserve">5.  </w:t>
+      </w:r>
+      <w:r>
+        <w:rPr>
+          <w:rFonts w:ascii="Calibri" w:hAnsi="Calibri"/>
+          <w:sz w:val="24"/>
+        </w:rPr>
+        <w:t>With the same video, use 'Convert to GIF'. Upload both the trimmed MP4 and the GIF.</w:t>
+      </w:r>
+    </w:p>
+    <w:p>
+      <w:r>
+        <w:rPr>
+          <w:rFonts w:ascii="Calibri" w:hAnsi="Calibri"/>
+          <w:b/>
+          <w:color w:val="38BDF8"/>
+          <w:sz w:val="24"/>
+        </w:rPr>
+        <w:t xml:space="preserve">6.  </w:t>
+      </w:r>
+      <w:r>
+        <w:rPr>
+          <w:rFonts w:ascii="Calibri" w:hAnsi="Calibri"/>
+          <w:sz w:val="24"/>
+        </w:rPr>
+        <w:t>Bonus: use a Generative AI Quick Action — 'Generate Template' or 'Remove Object'. Screenshot your result.</w:t>
+      </w:r>
+    </w:p>
+    <w:p>
+      <w:r>
+        <w:rPr>
+          <w:rFonts w:ascii="Calibri" w:hAnsi="Calibri"/>
+          <w:b w:val="0"/>
+          <w:i w:val="0"/>
+          <w:sz w:val="22"/>
+        </w:rPr>
+      </w:r>
+    </w:p>
+    <w:tbl>
+      <w:tblPr>
+        <w:tblW w:type="auto" w:w="0"/>
+        <w:tblLook w:firstColumn="1" w:firstRow="1" w:lastColumn="0" w:lastRow="0" w:noHBand="0" w:noVBand="1" w:val="04A0"/>
+      </w:tblPr>
+      <w:tblGrid>
+        <w:gridCol w:w="9972"/>
+      </w:tblGrid>
+      <w:tr>
+        <w:tc>
+          <w:tcPr>
+            <w:tcW w:type="dxa" w:w="9972"/>
+            <w:shd w:val="clear" w:color="auto" w:fill="E8F5E9"/>
+          </w:tcPr>
+          <w:p>
+            <w:r/>
+            <w:r>
+              <w:rPr>
+                <w:rFonts w:ascii="Calibri" w:hAnsi="Calibri"/>
+                <w:b/>
+                <w:color w:val="1B5E20"/>
+                <w:sz w:val="22"/>
+              </w:rPr>
+              <w:t>💡 PRO TIP</w:t>
+            </w:r>
+          </w:p>
+          <w:p>
+            <w:r>
+              <w:rPr>
+                <w:rFonts w:ascii="Calibri" w:hAnsi="Calibri"/>
+                <w:sz w:val="22"/>
+              </w:rPr>
+              <w:t>Quick Actions are designed for speed, not perfection. You're not meant to polish each one — you're training your brain to recognise which task calls which action. Muscle memory beats craftsmanship in speed work.</w:t>
+            </w:r>
+          </w:p>
+        </w:tc>
+      </w:tr>
+    </w:tbl>
+    <w:p>
+      <w:r>
+        <w:rPr>
+          <w:rFonts w:ascii="Calibri" w:hAnsi="Calibri"/>
+          <w:b w:val="0"/>
+          <w:i w:val="0"/>
+          <w:sz w:val="22"/>
+        </w:rPr>
+      </w:r>
+    </w:p>
+    <w:tbl>
+      <w:tblPr>
+        <w:tblW w:type="auto" w:w="0"/>
+        <w:tblLook w:firstColumn="1" w:firstRow="1" w:lastColumn="0" w:lastRow="0" w:noHBand="0" w:noVBand="1" w:val="04A0"/>
+      </w:tblPr>
+      <w:tblGrid>
+        <w:gridCol w:w="9972"/>
+      </w:tblGrid>
+      <w:tr>
+        <w:tc>
+          <w:tcPr>
+            <w:tcW w:type="dxa" w:w="9972"/>
+            <w:shd w:val="clear" w:color="auto" w:fill="FFF8E1"/>
+          </w:tcPr>
+          <w:p>
+            <w:r/>
+            <w:r>
+              <w:rPr>
+                <w:rFonts w:ascii="Calibri" w:hAnsi="Calibri"/>
+                <w:b/>
+                <w:color w:val="965000"/>
+                <w:sz w:val="22"/>
+              </w:rPr>
+              <w:t>🧭 IF YOU'RE STUCK</w:t>
+            </w:r>
+          </w:p>
+          <w:p>
+            <w:r>
+              <w:rPr>
+                <w:rFonts w:ascii="Calibri" w:hAnsi="Calibri"/>
+                <w:sz w:val="22"/>
+              </w:rPr>
+              <w:t>Quick Action missing from the menu? Scroll the Quick Actions home page — Adobe adds new ones often. If a file format won't convert, export as MP4 first then retry.</w:t>
+            </w:r>
+          </w:p>
+        </w:tc>
+      </w:tr>
+    </w:tbl>
+    <w:p>
+      <w:r>
+        <w:rPr>
+          <w:rFonts w:ascii="Calibri" w:hAnsi="Calibri"/>
+          <w:b w:val="0"/>
+          <w:i w:val="0"/>
+          <w:sz w:val="22"/>
+        </w:rPr>
+      </w:r>
+    </w:p>
+    <w:tbl>
+      <w:tblPr>
+        <w:tblW w:type="auto" w:w="0"/>
+        <w:tblLook w:firstColumn="1" w:firstRow="1" w:lastColumn="0" w:lastRow="0" w:noHBand="0" w:noVBand="1" w:val="04A0"/>
+      </w:tblPr>
+      <w:tblGrid>
+        <w:gridCol w:w="9972"/>
+      </w:tblGrid>
+      <w:tr>
+        <w:tc>
+          <w:tcPr>
+            <w:tcW w:type="dxa" w:w="9972"/>
+            <w:shd w:val="clear" w:color="auto" w:fill="E3F2FD"/>
+          </w:tcPr>
+          <w:p>
+            <w:r/>
+            <w:r>
+              <w:rPr>
+                <w:rFonts w:ascii="Calibri" w:hAnsi="Calibri"/>
+                <w:b/>
+                <w:color w:val="0D47A1"/>
+                <w:sz w:val="22"/>
+              </w:rPr>
+              <w:t>✅ WHAT YOU'LL HAVE AT THE END</w:t>
+            </w:r>
+          </w:p>
+          <w:p>
+            <w:r>
+              <w:rPr>
+                <w:rFonts w:ascii="Calibri" w:hAnsi="Calibri"/>
+                <w:sz w:val="22"/>
+              </w:rPr>
+              <w:t>Four (or five with bonus) files uploaded to Classroom under 'MP23 — Quick Actions Speed Run'.</w:t>
             </w:r>
           </w:p>
         </w:tc>

</xml_diff>